<commit_message>
Updated Static Analysis - Perform Analysis Procedure document (corrected header typo)
</commit_message>
<xml_diff>
--- a/source/reference_documents/tertiary_documents/implementation/Static Analysis/perform analysis/Static Analysis - Perform Analysis.docx
+++ b/source/reference_documents/tertiary_documents/implementation/Static Analysis/perform analysis/Static Analysis - Perform Analysis.docx
@@ -43,7 +43,7 @@
         <w:t xml:space="preserve">Version </w:t>
       </w:r>
       <w:r>
-        <w:t>3</w:t>
+        <w:t>4</w:t>
       </w:r>
     </w:p>
     <w:p>
@@ -60,7 +60,7 @@
         <w:rPr>
           <w:noProof/>
         </w:rPr>
-        <w:t>2/16/26 8:48 AM</w:t>
+        <w:t>4/6/26 1:31 PM</w:t>
       </w:r>
       <w:r>
         <w:fldChar w:fldCharType="end"/>
@@ -644,7 +644,7 @@
       </w:pPr>
       <w:r>
         <w:lastRenderedPageBreak/>
-        <w:t>Instrument Element</w:t>
+        <w:t>Perform Analysis</w:t>
       </w:r>
       <w:r>
         <w:t xml:space="preserve"> </w:t>

</xml_diff>